<commit_message>
docs: 补齐 hlgx_summary_report 全部版本记录(v2.0.0-cloudflare~v2.1.7)并同步重新生成两份 docx
</commit_message>
<xml_diff>
--- a/hualegexue/hlgx_summary_report.docx
+++ b/hualegexue/hlgx_summary_report.docx
@@ -76,10 +76,10 @@
         <w:rPr>
           <w:b/>
         </w:rPr>
-        <w:t>v2.0.0</w:t>
+        <w:t>v2.1.7</w:t>
       </w:r>
       <w:r>
-        <w:t>(2026-08-09)</w:t>
+        <w:t>(2026-08-10)</w:t>
       </w:r>
     </w:p>
     <w:p>
@@ -522,6 +522,816 @@
     </w:p>
     <w:p>
       <w:pPr>
+        <w:pStyle w:val="Heading3"/>
+      </w:pPr>
+      <w:r>
+        <w:t>v2.0.0-cloudflare(2026-08-09)</w:t>
+      </w:r>
+    </w:p>
+    <w:p>
+      <w:r/>
+      <w:r>
+        <w:rPr>
+          <w:b/>
+        </w:rPr>
+        <w:t>云端迁移 · Cloudflare Pages + KV</w:t>
+      </w:r>
+      <w:r/>
+    </w:p>
+    <w:p>
+      <w:pPr>
+        <w:pStyle w:val="ListBullet"/>
+      </w:pPr>
+      <w:r>
+        <w:t xml:space="preserve">排行榜与游戏静态资源整体迁移至 </w:t>
+      </w:r>
+      <w:r>
+        <w:rPr>
+          <w:b/>
+        </w:rPr>
+        <w:t>Cloudflare Pages + KV</w:t>
+      </w:r>
+      <w:r>
+        <w:t>:不再依赖本地 Flask 运行时</w:t>
+      </w:r>
+    </w:p>
+    <w:p>
+      <w:pPr>
+        <w:pStyle w:val="ListBullet"/>
+      </w:pPr>
+      <w:r>
+        <w:t>排行榜 API 上云(`/hlgx/api/rank`),KV 存储三难度榜单;`_routes.json` 路由白名单</w:t>
+      </w:r>
+    </w:p>
+    <w:p>
+      <w:pPr>
+        <w:pStyle w:val="ListBullet"/>
+      </w:pPr>
+      <w:r>
+        <w:t>旧 Flask 镜像冻结为遗留版本,不再双写(详细迁移过程见根目录 MIGRATION_AUDIT.md)</w:t>
+      </w:r>
+    </w:p>
+    <w:p>
+      <w:pPr>
+        <w:pStyle w:val="Heading3"/>
+      </w:pPr>
+      <w:r>
+        <w:t>v2.0.1(2026-08-09)</w:t>
+      </w:r>
+    </w:p>
+    <w:p>
+      <w:r/>
+      <w:r>
+        <w:rPr>
+          <w:b/>
+        </w:rPr>
+        <w:t>体验修正</w:t>
+      </w:r>
+      <w:r/>
+    </w:p>
+    <w:p>
+      <w:pPr>
+        <w:pStyle w:val="ListBullet"/>
+      </w:pPr>
+      <w:r>
+        <w:t>弹窗 / 界面加</w:t>
+      </w:r>
+      <w:r>
+        <w:rPr>
+          <w:b/>
+        </w:rPr>
+        <w:t>返回键</w:t>
+      </w:r>
+      <w:r>
+        <w:t>:不设昵称也可直接退出昵称窗(不必输入昵称才能返回)</w:t>
+      </w:r>
+    </w:p>
+    <w:p>
+      <w:pPr>
+        <w:pStyle w:val="ListBullet"/>
+      </w:pPr>
+      <w:r/>
+      <w:r>
+        <w:rPr>
+          <w:b/>
+        </w:rPr>
+        <w:t>过关判定修正</w:t>
+      </w:r>
+      <w:r>
+        <w:t>:全部拾取且手牌槽无三消组合才通关——「最后一步消除也计入」,消除完仍需继续消完手牌</w:t>
+      </w:r>
+    </w:p>
+    <w:p>
+      <w:pPr>
+        <w:pStyle w:val="Heading3"/>
+      </w:pPr>
+      <w:r>
+        <w:t>v2.0.2(2026-08-09)</w:t>
+      </w:r>
+    </w:p>
+    <w:p>
+      <w:r/>
+      <w:r>
+        <w:rPr>
+          <w:b/>
+        </w:rPr>
+        <w:t>安全与性能</w:t>
+      </w:r>
+      <w:r/>
+    </w:p>
+    <w:p>
+      <w:pPr>
+        <w:pStyle w:val="ListBullet"/>
+      </w:pPr>
+      <w:r/>
+      <w:r>
+        <w:rPr>
+          <w:b/>
+        </w:rPr>
+        <w:t>排行榜删除需管理员密码</w:t>
+      </w:r>
+      <w:r>
+        <w:t>:访客不再能清空榜单(仅 GET 可公开访问)</w:t>
+      </w:r>
+    </w:p>
+    <w:p>
+      <w:pPr>
+        <w:pStyle w:val="ListBullet"/>
+      </w:pPr>
+      <w:r/>
+      <w:r>
+        <w:rPr>
+          <w:b/>
+        </w:rPr>
+        <w:t>全站点击/按键响应提速</w:t>
+      </w:r>
+      <w:r>
+        <w:t>:滤镜过渡移除、像素坐标缓存(遮挡判定不再重复计算)、遮挡增量刷新(仅状态变化块更新)、手牌槽增量渲染</w:t>
+      </w:r>
+    </w:p>
+    <w:p>
+      <w:pPr>
+        <w:pStyle w:val="Heading3"/>
+      </w:pPr>
+      <w:r>
+        <w:t>v2.1.0(2026-08-10)</w:t>
+      </w:r>
+    </w:p>
+    <w:p>
+      <w:r/>
+      <w:r>
+        <w:rPr>
+          <w:b/>
+        </w:rPr>
+        <w:t>工程化重构(大版本)</w:t>
+      </w:r>
+      <w:r/>
+    </w:p>
+    <w:p>
+      <w:pPr>
+        <w:pStyle w:val="ListBullet"/>
+      </w:pPr>
+      <w:r/>
+      <w:r>
+        <w:rPr>
+          <w:b/>
+        </w:rPr>
+        <w:t>技术栈重构</w:t>
+      </w:r>
+      <w:r>
+        <w:t>:Vite + React 19 + TypeScript + Tailwind CSS + shadcn/ui + React Router 7;</w:t>
+      </w:r>
+    </w:p>
+    <w:p>
+      <w:r>
+        <w:t xml:space="preserve">  多页构建(游戏入口 / 管理后台入口),纯逻辑(棋盘/消除/胜负)与 UI 分离,可测性强</w:t>
+      </w:r>
+    </w:p>
+    <w:p>
+      <w:pPr>
+        <w:pStyle w:val="ListBullet"/>
+      </w:pPr>
+      <w:r/>
+      <w:r>
+        <w:rPr>
+          <w:b/>
+        </w:rPr>
+        <w:t>游戏三页面重写</w:t>
+      </w:r>
+      <w:r>
+        <w:t>:大厅 / 游戏页 / 榜单页 + 新手引导(可跳过、「不再显示」)+ 人性化文案 + 全站移动端适配</w:t>
+      </w:r>
+    </w:p>
+    <w:p>
+      <w:pPr>
+        <w:pStyle w:val="ListBullet"/>
+      </w:pPr>
+      <w:r/>
+      <w:r>
+        <w:rPr>
+          <w:b/>
+        </w:rPr>
+        <w:t>管理后台 /admin</w:t>
+      </w:r>
+      <w:r>
+        <w:t>:令牌登录;四大模块——数据看板 / 榜单管理(单条删、清榜)/ 审计日志 / 会话管理;</w:t>
+      </w:r>
+    </w:p>
+    <w:p>
+      <w:r>
+        <w:t xml:space="preserve">  操作全程审计、危险操作二次确认;</w:t>
+      </w:r>
+      <w:r>
+        <w:rPr>
+          <w:b/>
+        </w:rPr>
+        <w:t>管理功能全部收归后台,用户界面只保留查看与提交</w:t>
+      </w:r>
+      <w:r/>
+    </w:p>
+    <w:p>
+      <w:pPr>
+        <w:pStyle w:val="ListBullet"/>
+      </w:pPr>
+      <w:r/>
+      <w:r>
+        <w:rPr>
+          <w:b/>
+        </w:rPr>
+        <w:t>用户 API 加固</w:t>
+      </w:r>
+      <w:r>
+        <w:t>:提交限频(60s/IP)、昵称清洗(trim/去控制字符/长度限制)、单难度榜单上限 200 条</w:t>
+      </w:r>
+    </w:p>
+    <w:p>
+      <w:pPr>
+        <w:pStyle w:val="ListBullet"/>
+      </w:pPr>
+      <w:r/>
+      <w:r>
+        <w:rPr>
+          <w:b/>
+        </w:rPr>
+        <w:t>体验统一</w:t>
+      </w:r>
+      <w:r>
+        <w:t>:所有弹窗带右上角 ✕ 关闭(Esc 亦可);胜负/结算弹窗解释排名规则与扣血原因</w:t>
+      </w:r>
+    </w:p>
+    <w:p>
+      <w:pPr>
+        <w:pStyle w:val="ListBullet"/>
+      </w:pPr>
+      <w:r>
+        <w:t>旧版全部断言迁移至 Vitest,新增 API 契约自测与端到端测试</w:t>
+      </w:r>
+    </w:p>
+    <w:p>
+      <w:pPr>
+        <w:pStyle w:val="Heading3"/>
+      </w:pPr>
+      <w:r>
+        <w:t>v2.1.1(2026-08-10)</w:t>
+      </w:r>
+    </w:p>
+    <w:p>
+      <w:r/>
+      <w:r>
+        <w:rPr>
+          <w:b/>
+        </w:rPr>
+        <w:t>缺陷修复与体验优化</w:t>
+      </w:r>
+      <w:r/>
+    </w:p>
+    <w:p>
+      <w:pPr>
+        <w:pStyle w:val="ListBullet"/>
+      </w:pPr>
+      <w:r/>
+      <w:r>
+        <w:rPr>
+          <w:b/>
+        </w:rPr>
+        <w:t>修复「幽灵容器」拦截点击</w:t>
+      </w:r>
+      <w:r>
+        <w:t>:已移除卡牌的父定位容器仍拦截点击,导致部分解锁卡牌无法入槽;</w:t>
+      </w:r>
+    </w:p>
+    <w:p>
+      <w:r>
+        <w:t xml:space="preserve">  由视觉 QA 复现(dom-evidence)定位,修复为容器 `pointer-events:none` + 卡牌显式恢复可点,qa-repro 回归通过</w:t>
+      </w:r>
+    </w:p>
+    <w:p>
+      <w:pPr>
+        <w:pStyle w:val="ListBullet"/>
+      </w:pPr>
+      <w:r/>
+      <w:r>
+        <w:rPr>
+          <w:b/>
+        </w:rPr>
+        <w:t>昵称记忆</w:t>
+      </w:r>
+      <w:r>
+        <w:t>:localStorage 记住上次输入,刷新/再次进入自动预填</w:t>
+      </w:r>
+    </w:p>
+    <w:p>
+      <w:pPr>
+        <w:pStyle w:val="ListBullet"/>
+      </w:pPr>
+      <w:r/>
+      <w:r>
+        <w:rPr>
+          <w:b/>
+        </w:rPr>
+        <w:t>开发体验</w:t>
+      </w:r>
+      <w:r>
+        <w:t>:JSX 元素自动注入 `data-code-path="文件:行:列"`(仅 dev 模式,便于定位组件)</w:t>
+      </w:r>
+    </w:p>
+    <w:p>
+      <w:pPr>
+        <w:pStyle w:val="Heading3"/>
+      </w:pPr>
+      <w:r>
+        <w:t>v2.1.2(2026-08-10)</w:t>
+      </w:r>
+    </w:p>
+    <w:p>
+      <w:r/>
+      <w:r>
+        <w:rPr>
+          <w:b/>
+        </w:rPr>
+        <w:t>安全事件处置与加固</w:t>
+      </w:r>
+      <w:r/>
+    </w:p>
+    <w:p>
+      <w:pPr>
+        <w:pStyle w:val="ListBullet"/>
+      </w:pPr>
+      <w:r/>
+      <w:r>
+        <w:rPr>
+          <w:b/>
+        </w:rPr>
+        <w:t>安全事件</w:t>
+      </w:r>
+      <w:r>
+        <w:t>:攻击者(IP 36.102.35.x)经泄露的管理员令牌登录后台刷入虚假排行榜记录(由审计日志发现)</w:t>
+      </w:r>
+    </w:p>
+    <w:p>
+      <w:pPr>
+        <w:pStyle w:val="ListBullet"/>
+      </w:pPr>
+      <w:r/>
+      <w:r>
+        <w:rPr>
+          <w:b/>
+        </w:rPr>
+        <w:t>处置</w:t>
+      </w:r>
+      <w:r>
+        <w:t>:轮换 ADMIN_TOKEN、清除全部管理会话、清理被污染的榜单数据</w:t>
+      </w:r>
+    </w:p>
+    <w:p>
+      <w:pPr>
+        <w:pStyle w:val="ListBullet"/>
+      </w:pPr>
+      <w:r/>
+      <w:r>
+        <w:rPr>
+          <w:b/>
+        </w:rPr>
+        <w:t>提交 API 加固</w:t>
+      </w:r>
+      <w:r>
+        <w:t>:用时 &lt;10 秒拒绝(防脚本刷假成绩)、昵称过滤 `&lt;` `&gt;` 字符(防注入试探)、</w:t>
+      </w:r>
+    </w:p>
+    <w:p>
+      <w:r>
+        <w:t xml:space="preserve">  同一昵称 24h 内限 3 次(防同名刷屏)</w:t>
+      </w:r>
+    </w:p>
+    <w:p>
+      <w:pPr>
+        <w:pStyle w:val="Heading3"/>
+      </w:pPr>
+      <w:r>
+        <w:t>v2.1.3(2026-08-10)</w:t>
+      </w:r>
+    </w:p>
+    <w:p>
+      <w:r/>
+      <w:r>
+        <w:rPr>
+          <w:b/>
+        </w:rPr>
+        <w:t>昵称规则</w:t>
+      </w:r>
+      <w:r/>
+    </w:p>
+    <w:p>
+      <w:pPr>
+        <w:pStyle w:val="ListBullet"/>
+      </w:pPr>
+      <w:r/>
+      <w:r>
+        <w:rPr>
+          <w:b/>
+        </w:rPr>
+        <w:t>最多 10 个字</w:t>
+      </w:r>
+      <w:r>
+        <w:t>:界面实时计数(X/10),超长即时拦截,后端同样强制</w:t>
+      </w:r>
+    </w:p>
+    <w:p>
+      <w:pPr>
+        <w:pStyle w:val="ListBullet"/>
+      </w:pPr>
+      <w:r/>
+      <w:r>
+        <w:rPr>
+          <w:b/>
+        </w:rPr>
+        <w:t>违禁词检测</w:t>
+      </w:r>
+      <w:r>
+        <w:t>:违背公序良俗的字词组合(辱骂/色情等)一律拒绝;前后端双份词表,</w:t>
+      </w:r>
+    </w:p>
+    <w:p>
+      <w:r>
+        <w:t xml:space="preserve">  后端强制 400——含违禁词无法进入游戏、无法上榜</w:t>
+      </w:r>
+    </w:p>
+    <w:p>
+      <w:pPr>
+        <w:pStyle w:val="Heading3"/>
+      </w:pPr>
+      <w:r>
+        <w:t>v2.1.4(2026-08-10)</w:t>
+      </w:r>
+    </w:p>
+    <w:p>
+      <w:r/>
+      <w:r>
+        <w:rPr>
+          <w:b/>
+        </w:rPr>
+        <w:t>平台分榜与版本治理</w:t>
+      </w:r>
+      <w:r/>
+    </w:p>
+    <w:p>
+      <w:pPr>
+        <w:pStyle w:val="ListBullet"/>
+      </w:pPr>
+      <w:r/>
+      <w:r>
+        <w:rPr>
+          <w:b/>
+        </w:rPr>
+        <w:t>版本号统一</w:t>
+      </w:r>
+      <w:r>
+        <w:t>:全站版本单一来源 `src/version.ts`,界面版本号跟随发布自动更新(修复旧版界面版本停留问题)</w:t>
+      </w:r>
+    </w:p>
+    <w:p>
+      <w:pPr>
+        <w:pStyle w:val="ListBullet"/>
+      </w:pPr>
+      <w:r/>
+      <w:r>
+        <w:rPr>
+          <w:b/>
+        </w:rPr>
+        <w:t>违禁词扩充</w:t>
+      </w:r>
+      <w:r>
+        <w:t>:补充违反党史国情/国家大政方针的词条 + 英文脏话(f</w:t>
+      </w:r>
+      <w:r>
+        <w:rPr>
+          <w:b/>
+        </w:rPr>
+        <w:t>k 等遮蔽写法)</w:t>
+      </w:r>
+    </w:p>
+    <w:p>
+      <w:pPr>
+        <w:pStyle w:val="ListBullet"/>
+      </w:pPr>
+      <w:r/>
+      <w:r>
+        <w:rPr>
+          <w:b/>
+        </w:rPr>
+        <w:t>手游/端游榜单分离</w:t>
+      </w:r>
+      <w:r>
+        <w:t>:平台自动检测(pointer/maxTouchPoints/UA 兜底);提交时区分平台,</w:t>
+      </w:r>
+    </w:p>
+    <w:p>
+      <w:r>
+        <w:t xml:space="preserve">  榜单分开展示(端游/手游 tabs);</w:t>
+      </w:r>
+      <w:r>
+        <w:rPr>
+          <w:b/>
+        </w:rPr>
+        <w:t>排名仅与同平台比较</w:t>
+      </w:r>
+      <w:r>
+        <w:t>;历史条目(无平台字段)归端游;管理端显示平台列</w:t>
+      </w:r>
+    </w:p>
+    <w:p>
+      <w:pPr>
+        <w:pStyle w:val="Heading3"/>
+      </w:pPr>
+      <w:r>
+        <w:t>v2.1.5(2026-08-10)</w:t>
+      </w:r>
+    </w:p>
+    <w:p>
+      <w:r/>
+      <w:r>
+        <w:rPr>
+          <w:b/>
+        </w:rPr>
+        <w:t>物质库扩容与多类别消除</w:t>
+      </w:r>
+      <w:r/>
+    </w:p>
+    <w:p>
+      <w:pPr>
+        <w:pStyle w:val="ListBullet"/>
+      </w:pPr>
+      <w:r/>
+      <w:r>
+        <w:rPr>
+          <w:b/>
+        </w:rPr>
+        <w:t>物质库扩容至 218 种</w:t>
+      </w:r>
+      <w:r>
+        <w:t>:新增 12 种有机物(环己烷/异丁烷/正戊烷/异戊二烯/甲酸/草酸/苯乙烯/</w:t>
+      </w:r>
+    </w:p>
+    <w:p>
+      <w:r>
+        <w:t xml:space="preserve">  苯胺/硝基苯/尿素/甘氨酸/氯乙烯)+ 9 种盐(硫代硫酸钠/亚硫酸氢钠/过二硫酸钾/碳酸铵/磷酸铵/</w:t>
+      </w:r>
+    </w:p>
+    <w:p>
+      <w:r>
+        <w:t xml:space="preserve">  铬酸钠/硫酸铬/硫化亚铁/铬酸银);其他类别本次不新增</w:t>
+      </w:r>
+    </w:p>
+    <w:p>
+      <w:pPr>
+        <w:pStyle w:val="ListBullet"/>
+      </w:pPr>
+      <w:r/>
+      <w:r>
+        <w:rPr>
+          <w:b/>
+        </w:rPr>
+        <w:t>多类别消除(有机酸双身份)</w:t>
+      </w:r>
+      <w:r>
+        <w:t>:醋酸/甲酸/草酸(主类酸)+ 苯甲酸/甘氨酸(主类有机物)跨类——</w:t>
+      </w:r>
+    </w:p>
+    <w:p>
+      <w:r>
+        <w:t xml:space="preserve">  既能与盐酸、硫酸等无机酸按「酸」消除,也能与甲烷、乙醇等按「有机物」消除;</w:t>
+      </w:r>
+    </w:p>
+    <w:p>
+      <w:r>
+        <w:t xml:space="preserve">  `canEliminate`/`clearSelected` 按全部类别交集判定</w:t>
+      </w:r>
+    </w:p>
+    <w:p>
+      <w:pPr>
+        <w:pStyle w:val="ListBullet"/>
+      </w:pPr>
+      <w:r/>
+      <w:r>
+        <w:rPr>
+          <w:b/>
+        </w:rPr>
+        <w:t>简介全部重写(218 条)</w:t>
+      </w:r>
+      <w:r>
+        <w:t>:保持 ≤10 字(去除 ,，· 后),内容更具体(如氢氧化钾「制软皂,强腐蚀」),</w:t>
+      </w:r>
+    </w:p>
+    <w:p>
+      <w:r>
+        <w:t xml:space="preserve">  </w:t>
+      </w:r>
+      <w:r>
+        <w:rPr>
+          <w:b/>
+        </w:rPr>
+        <w:t>不暴露物质类别</w:t>
+      </w:r>
+      <w:r>
+        <w:t>(悬停可见,防玩家靠简介作弊);新增 Vitest 断言逐条扫描</w:t>
+      </w:r>
+    </w:p>
+    <w:p>
+      <w:pPr>
+        <w:pStyle w:val="ListBullet"/>
+      </w:pPr>
+      <w:r>
+        <w:t>玩法介绍补充有机酸双类别规则</w:t>
+      </w:r>
+    </w:p>
+    <w:p>
+      <w:pPr>
+        <w:pStyle w:val="Heading3"/>
+      </w:pPr>
+      <w:r>
+        <w:t>v2.1.6(2026-08-10)</w:t>
+      </w:r>
+    </w:p>
+    <w:p>
+      <w:r/>
+      <w:r>
+        <w:rPr>
+          <w:b/>
+        </w:rPr>
+        <w:t>放开同名昵称与玩法说明完善</w:t>
+      </w:r>
+      <w:r/>
+    </w:p>
+    <w:p>
+      <w:pPr>
+        <w:pStyle w:val="ListBullet"/>
+      </w:pPr>
+      <w:r/>
+      <w:r>
+        <w:rPr>
+          <w:b/>
+        </w:rPr>
+        <w:t>放开同名昵称</w:t>
+      </w:r>
+      <w:r>
+        <w:t>:删除「同名 24h 限 3 次」限制、删除查重接口(/hlgx/api/name/exists、/suggest)</w:t>
+      </w:r>
+    </w:p>
+    <w:p>
+      <w:r>
+        <w:t xml:space="preserve">  与前端重名提示、删除自动尾缀编号(`X*001`)机制——靠上榜时间区分不同玩家,同名可正常多次上榜</w:t>
+      </w:r>
+    </w:p>
+    <w:p>
+      <w:pPr>
+        <w:pStyle w:val="ListBullet"/>
+      </w:pPr>
+      <w:r/>
+      <w:r>
+        <w:rPr>
+          <w:b/>
+        </w:rPr>
+        <w:t>玩法介绍完善</w:t>
+      </w:r>
+      <w:r>
+        <w:t>:明确分类标准共 7 类(金属单质/非金属单质/有机物/酸/碱/盐/氧化物),</w:t>
+      </w:r>
+    </w:p>
+    <w:p>
+      <w:r>
+        <w:t xml:space="preserve">  </w:t>
+      </w:r>
+      <w:r>
+        <w:rPr>
+          <w:b/>
+        </w:rPr>
+        <w:t>金属单质与非金属单质是两类、不能互消</w:t>
+      </w:r>
+      <w:r>
+        <w:t>;「同类」定义去掉实际举例精简文案;</w:t>
+      </w:r>
+    </w:p>
+    <w:p>
+      <w:r>
+        <w:t xml:space="preserve">  文案「压着别人的牌」改「压着别的牌的牌」(消除歧义)</w:t>
+      </w:r>
+    </w:p>
+    <w:p>
+      <w:pPr>
+        <w:pStyle w:val="ListBullet"/>
+      </w:pPr>
+      <w:r>
+        <w:t>保留全部防刷机制(60s/IP 限频、违禁词、10 字限制、`&lt; &gt;` 过滤、成绩 ≥10s)</w:t>
+      </w:r>
+    </w:p>
+    <w:p>
+      <w:pPr>
+        <w:pStyle w:val="Heading3"/>
+      </w:pPr>
+      <w:r>
+        <w:t>v2.1.7(2026-08-10)</w:t>
+      </w:r>
+    </w:p>
+    <w:p>
+      <w:r/>
+      <w:r>
+        <w:rPr>
+          <w:b/>
+        </w:rPr>
+        <w:t>数据安全修复</w:t>
+      </w:r>
+      <w:r/>
+    </w:p>
+    <w:p>
+      <w:pPr>
+        <w:pStyle w:val="ListBullet"/>
+      </w:pPr>
+      <w:r/>
+      <w:r>
+        <w:rPr>
+          <w:b/>
+        </w:rPr>
+        <w:t>事故</w:t>
+      </w:r>
+      <w:r>
+        <w:t>:生产验证脚本 verify_prod 采用「清空全部榜单 → 人工恢复」流程,恢复环节遗漏会</w:t>
+      </w:r>
+      <w:r>
+        <w:rPr>
+          <w:b/>
+        </w:rPr>
+        <w:t>丢失玩家排行榜记录</w:t>
+      </w:r>
+      <w:r/>
+    </w:p>
+    <w:p>
+      <w:pPr>
+        <w:pStyle w:val="ListBullet"/>
+      </w:pPr>
+      <w:r/>
+      <w:r>
+        <w:rPr>
+          <w:b/>
+        </w:rPr>
+        <w:t>修复</w:t>
+      </w:r>
+      <w:r>
+        <w:t>:脚本彻底</w:t>
+      </w:r>
+      <w:r>
+        <w:rPr>
+          <w:b/>
+        </w:rPr>
+        <w:t>非破坏化</w:t>
+      </w:r>
+      <w:r>
+        <w:t>——全程不再调用清榜 API;收尾仅按唯一测试昵称</w:t>
+      </w:r>
+      <w:r>
+        <w:rPr>
+          <w:b/>
+        </w:rPr>
+        <w:t>单条删除</w:t>
+      </w:r>
+      <w:r>
+        <w:t>本脚本自己</w:t>
+      </w:r>
+    </w:p>
+    <w:p>
+      <w:r>
+        <w:t xml:space="preserve">  提交的测试条目,并断言真实数据原样保留;可连续重跑、多次运行互不影响</w:t>
+      </w:r>
+    </w:p>
+    <w:p>
+      <w:pPr>
+        <w:pStyle w:val="ListBullet"/>
+      </w:pPr>
+      <w:r>
+        <w:t>追溯:审计日志持续记录删条/清榜操作(rank_delete_one / rank_clear_mode / rank_clear_all),管理员后台可查</w:t>
+      </w:r>
+    </w:p>
+    <w:p>
+      <w:pPr>
         <w:pStyle w:val="Heading2"/>
       </w:pPr>
       <w:r>
@@ -723,7 +1533,7 @@
         <w:pStyle w:val="Heading3"/>
       </w:pPr>
       <w:r>
-        <w:t>物质库统计(197 种)</w:t>
+        <w:t>物质库统计(218 种, v2.1.5 扩容)</w:t>
       </w:r>
     </w:p>
     <w:tbl>
@@ -841,7 +1651,7 @@
           </w:tcPr>
           <w:p>
             <w:r>
-              <w:t>18</w:t>
+              <w:t>20</w:t>
             </w:r>
           </w:p>
         </w:tc>
@@ -885,7 +1695,7 @@
           </w:tcPr>
           <w:p>
             <w:r>
-              <w:t>59</w:t>
+              <w:t>68</w:t>
             </w:r>
           </w:p>
         </w:tc>
@@ -907,7 +1717,7 @@
           </w:tcPr>
           <w:p>
             <w:r>
-              <w:t>25</w:t>
+              <w:t>35</w:t>
             </w:r>
           </w:p>
         </w:tc>

</xml_diff>